<commit_message>
publish student projects (Fall 2026) 2026-09-22 18:45
</commit_message>
<xml_diff>
--- a/Social-Media/sggotwhat.docx
+++ b/Social-Media/sggotwhat.docx
@@ -2355,13 +2355,13 @@
         <w:rPr>
           <w:b/>
         </w:rPr>
-        <w:t xml:space="preserve">Recommended composition:</w:t>
-      </w:r>
-      <w:r>
-        <w:t xml:space="preserve"> </w:t>
-      </w:r>
-      <w:r>
-        <w:t xml:space="preserve">6 CS + 2 Design + 0 Art (8) — SGGotWhat? is a UX-heavy social utility: the map/nearby discovery, the personalised feed, events filtering, day-out itineraries, profiles/trust and the community-submission flow are a strong two-designer load, while the visual surface (map markers, category icons, trust badges) is UI-art the designers own and photos are user-supplied — no character/illustration production, so 0 artists (rules: min 1 Design mandated, max 9 total, D+A ≤ 3; see</w:t>
+        <w:t xml:space="preserve">Team composition (set by instructor):</w:t>
+      </w:r>
+      <w:r>
+        <w:t xml:space="preserve"> </w:t>
+      </w:r>
+      <w:r>
+        <w:t xml:space="preserve">6 CS + 1 Design + 0 Art (7) — SGGotWhat? is a UX-heavy social utility (map/nearby discovery, the personalised feed, events filtering, day-out itineraries, profiles/trust and the community-submission flow), and the visual surface (map markers, category icons, trust badges) is UI-art the designer owns while photos are user-supplied — no character/illustration production, so 0 artists (rules: min 1 Design mandated, max 9 total, D+A ≤ 3; see</w:t>
       </w:r>
       <w:r>
         <w:t xml:space="preserve"> </w:t>
@@ -2373,7 +2373,7 @@
         <w:t xml:space="preserve">team-formation.pdf</w:t>
       </w:r>
       <w:r>
-        <w:t xml:space="preserve">). With 0 artists, the designers take the</w:t>
+        <w:t xml:space="preserve">). With 0 artists, the designer takes the</w:t>
       </w:r>
       <w:r>
         <w:t xml:space="preserve"> </w:t>
@@ -2389,6 +2389,51 @@
       </w:r>
       <w:r>
         <w:t xml:space="preserve">as a real graded Design goal each milestone (M1 Art Proof of Concept / M2 Art Implementation Quality) — the last Design goal each milestone.</w:t>
+      </w:r>
+      <w:r>
+        <w:t xml:space="preserve"> </w:t>
+      </w:r>
+      <w:r>
+        <w:rPr>
+          <w:i/>
+        </w:rPr>
+        <w:t xml:space="preserve">Note:</w:t>
+      </w:r>
+      <w:r>
+        <w:t xml:space="preserve"> </w:t>
+      </w:r>
+      <w:r>
+        <w:t xml:space="preserve">this is the</w:t>
+      </w:r>
+      <w:r>
+        <w:t xml:space="preserve"> </w:t>
+      </w:r>
+      <w:r>
+        <w:rPr>
+          <w:b/>
+        </w:rPr>
+        <w:t xml:space="preserve">solo-designer + 0-artist</w:t>
+      </w:r>
+      <w:r>
+        <w:t xml:space="preserve"> </w:t>
+      </w:r>
+      <w:r>
+        <w:t xml:space="preserve">case the design pool flags — one designer now carries the full 4-goals-per-milestone Design + UI/UX load</w:t>
+      </w:r>
+      <w:r>
+        <w:t xml:space="preserve"> </w:t>
+      </w:r>
+      <w:r>
+        <w:rPr>
+          <w:i/>
+        </w:rPr>
+        <w:t xml:space="preserve">and</w:t>
+      </w:r>
+      <w:r>
+        <w:t xml:space="preserve"> </w:t>
+      </w:r>
+      <w:r>
+        <w:t xml:space="preserve">the D11 art surface, which is a heavy load for a UX-heavy social app; a 2nd designer would relieve it if the team can, and the instructor should confirm which conditional bends if the load is too tight.</w:t>
       </w:r>
     </w:p>
     <w:p>
@@ -2456,30 +2501,6 @@
         <w:pStyle w:val="Compact"/>
       </w:pPr>
       <w:r>
-        <w:t xml:space="preserve">M1D3 User Research, Personas &amp; Competitive Analysis (teardown of Atlas Obscura / Foursquare / Citymapper; SG explorer personas)</w:t>
-      </w:r>
-    </w:p>
-    <w:p>
-      <w:pPr>
-        <w:numPr>
-          <w:ilvl w:val="1"/>
-          <w:numId w:val="1019"/>
-        </w:numPr>
-        <w:pStyle w:val="Compact"/>
-      </w:pPr>
-      <w:r>
-        <w:t xml:space="preserve">M1D5 Interaction &amp; Input Design (map interactions, auto-expanding-radius affordance, submission flow, proximity-duplicate prompt)</w:t>
-      </w:r>
-    </w:p>
-    <w:p>
-      <w:pPr>
-        <w:numPr>
-          <w:ilvl w:val="1"/>
-          <w:numId w:val="1019"/>
-        </w:numPr>
-        <w:pStyle w:val="Compact"/>
-      </w:pPr>
-      <w:r>
         <w:t xml:space="preserve">M1D11 Art Proof of Concept (conditional — no artist: map-marker/category-icon/trust-badge set, UI style guide)</w:t>
       </w:r>
     </w:p>
@@ -2519,30 +2540,6 @@
         <w:pStyle w:val="Compact"/>
       </w:pPr>
       <w:r>
-        <w:t xml:space="preserve">M2D2 Visual Branding &amp; Style Guide (SGGotWhat? identity; the trust-level / trending-badge system)</w:t>
-      </w:r>
-    </w:p>
-    <w:p>
-      <w:pPr>
-        <w:numPr>
-          <w:ilvl w:val="1"/>
-          <w:numId w:val="1020"/>
-        </w:numPr>
-        <w:pStyle w:val="Compact"/>
-      </w:pPr>
-      <w:r>
-        <w:t xml:space="preserve">M2D5 Playtesting &amp; Iteration Program (discovery relevance, submission friction, itinerary usefulness)</w:t>
-      </w:r>
-    </w:p>
-    <w:p>
-      <w:pPr>
-        <w:numPr>
-          <w:ilvl w:val="1"/>
-          <w:numId w:val="1020"/>
-        </w:numPr>
-        <w:pStyle w:val="Compact"/>
-      </w:pPr>
-      <w:r>
         <w:t xml:space="preserve">M2D11 Art Implementation Quality (conditional — no artist: UI art/icons implemented to standard)</w:t>
       </w:r>
     </w:p>
@@ -2582,30 +2579,6 @@
     <w:p>
       <w:pPr>
         <w:numPr>
-          <w:ilvl w:val="1"/>
-          <w:numId w:val="1021"/>
-        </w:numPr>
-        <w:pStyle w:val="Compact"/>
-      </w:pPr>
-      <w:r>
-        <w:t xml:space="preserve">M1U2 UX Flows &amp; Wireframes — discover → plan → submit → validate journeys.</w:t>
-      </w:r>
-    </w:p>
-    <w:p>
-      <w:pPr>
-        <w:numPr>
-          <w:ilvl w:val="1"/>
-          <w:numId w:val="1021"/>
-        </w:numPr>
-        <w:pStyle w:val="Compact"/>
-      </w:pPr>
-      <w:r>
-        <w:t xml:space="preserve">M1U3 Accessibility &amp; Readability Foundations — legible map/feed typography, contrast, thumb-reach targets.</w:t>
-      </w:r>
-    </w:p>
-    <w:p>
-      <w:pPr>
-        <w:numPr>
           <w:ilvl w:val="0"/>
           <w:numId w:val="1018"/>
         </w:numPr>
@@ -2645,30 +2618,6 @@
     <w:p>
       <w:pPr>
         <w:numPr>
-          <w:ilvl w:val="1"/>
-          <w:numId w:val="1022"/>
-        </w:numPr>
-        <w:pStyle w:val="Compact"/>
-      </w:pPr>
-      <w:r>
-        <w:t xml:space="preserve">M2U3 Menu &amp; HUD Motion Design — map cluster/expand animation, feed re-sort, trending transitions.</w:t>
-      </w:r>
-    </w:p>
-    <w:p>
-      <w:pPr>
-        <w:numPr>
-          <w:ilvl w:val="1"/>
-          <w:numId w:val="1022"/>
-        </w:numPr>
-        <w:pStyle w:val="Compact"/>
-      </w:pPr>
-      <w:r>
-        <w:t xml:space="preserve">M2U5 Mobile UX Adaptation &amp; Ergonomics — one-handed map/discovery use on the Pixel 9a, on-the-go.</w:t>
-      </w:r>
-    </w:p>
-    <w:p>
-      <w:pPr>
-        <w:numPr>
           <w:ilvl w:val="0"/>
           <w:numId w:val="1018"/>
         </w:numPr>
@@ -2684,7 +2633,7 @@
         <w:t xml:space="preserve"> </w:t>
       </w:r>
       <w:r>
-        <w:t xml:space="preserve">0 artists — the art surface is covered by the D11 conditionals, taken as Design goals (see Design M1/M2).</w:t>
+        <w:t xml:space="preserve">0 artists — the art surface is covered by the D11 conditionals, taken as Design goals by the single designer (see Design M1/M2).</w:t>
       </w:r>
     </w:p>
     <w:p>

</xml_diff>